<commit_message>
Actualiza Modelo E-R: agrega circuito_id a alarmas
</commit_message>
<xml_diff>
--- a/docs/Fase 2/Evidencias Proyecto (Version Agil)/Documento 05 - Documento de Diseño.docx
+++ b/docs/Fase 2/Evidencias Proyecto (Version Agil)/Documento 05 - Documento de Diseño.docx
@@ -2454,7 +2454,7 @@
           <w:noProof/>
         </w:rPr>
         <w:drawing>
-          <wp:inline distT="0" distB="0" distL="0" distR="0" wp14:anchorId="48801D6F" wp14:editId="75F60F33">
+          <wp:inline distT="0" distB="0" distL="0" distR="0" wp14:anchorId="01107E9B" wp14:editId="70D59E81">
             <wp:extent cx="5600000" cy="4827866"/>
             <wp:effectExtent l="0" t="0" r="0" b="0"/>
             <wp:docPr id="101" name="Diagrama de Casos de Uso"/>
@@ -2522,8 +2522,8 @@
           <w:noProof/>
         </w:rPr>
         <w:drawing>
-          <wp:inline distT="0" distB="0" distL="0" distR="0" wp14:anchorId="7BB21C99" wp14:editId="7B000A32">
-            <wp:extent cx="4572000" cy="6649000"/>
+          <wp:inline distT="0" distB="0" distL="0" distR="0" wp14:anchorId="4E2E9C6C" wp14:editId="6D33AD47">
+            <wp:extent cx="4572000" cy="6435000"/>
             <wp:effectExtent l="0" t="0" r="0" b="0"/>
             <wp:docPr id="102" name="Modelo E-R"/>
             <wp:cNvGraphicFramePr>
@@ -2545,7 +2545,7 @@
                   <pic:spPr>
                     <a:xfrm>
                       <a:off x="0" y="0"/>
-                      <a:ext cx="4572000" cy="6649000"/>
+                      <a:ext cx="4572000" cy="6435000"/>
                     </a:xfrm>
                     <a:prstGeom prst="rect">
                       <a:avLst/>
@@ -2570,7 +2570,7 @@
           <w:i/>
           <w:lang w:val="es-ES" w:eastAsia="es-ES"/>
         </w:rPr>
-        <w:t xml:space="preserve">Nota de diseño: la tabla calibres_cable es una extensión opcional fuera del alcance comprometido del MVP (valores de ampacidad de cable, a completar más adelante). La tabla circuitos, en cambio, es parte del diseño core: cada tablero puede tener uno o más analizadores AcuRev, y cada AcuRev mide varios circuitos de forma independiente (monofásicos o trifásicos), cada uno con su propio </w:t>
+        <w:t xml:space="preserve">Nota de diseño: la tabla calibres_cable es una extensión opcional fuera del alcance comprometido del MVP (valores de ampacidad de cable, a completar más adelante). La tabla circuitos, en cambio, es parte del diseño core: cada tablero puede tener uno o más analizadores AcuRev, y cada AcuRev mide varios circuitos de forma independiente (monofásicos o trifásicos), cada uno con su propio umbral de alarma configurado en umbrales_configurados — el umbral no se evalúa a nivel del </w:t>
       </w:r>
       <w:r>
         <w:rPr>
@@ -2578,7 +2578,7 @@
           <w:lang w:val="es-ES" w:eastAsia="es-ES"/>
         </w:rPr>
         <w:lastRenderedPageBreak/>
-        <w:t>umbral de alarma configurado en umbrales_configurados — el umbral no se evalúa a nivel del tablero general, sino por circuito. La comunicación entre el dispositivo AcuRev-2110-mV-WEB2 y el backend es HTTP/HTTPS push mediante su función nativa ‘Post Channels’ (intervalo de 1 minuto para variables de energía, 15 segundos si se requiere tiempo real), con un buffer local de hasta 3GB si se pierde la conexión. El backend no realiza polling Modbus. Este mecanismo debe reflejarse también en el futuro Diagrama de Componentes y Diagrama de Secuencia.</w:t>
+        <w:t>tablero general, sino por circuito. La comunicación entre el dispositivo AcuRev-2110-mV-WEB2 y el backend es HTTP/HTTPS push mediante su función nativa ‘Post Channels’ (intervalo de 1 minuto para variables de energía, 15 segundos si se requiere tiempo real), con un buffer local de hasta 3GB si se pierde la conexión. El backend no realiza polling Modbus. Este mecanismo debe reflejarse también en el futuro Diagrama de Componentes y Diagrama de Secuencia.</w:t>
       </w:r>
     </w:p>
     <w:p>
@@ -2597,7 +2597,7 @@
           <w:noProof/>
         </w:rPr>
         <w:drawing>
-          <wp:inline distT="0" distB="0" distL="0" distR="0" wp14:anchorId="4B9420AA" wp14:editId="0CB60762">
+          <wp:inline distT="0" distB="0" distL="0" distR="0" wp14:anchorId="728B7905" wp14:editId="6BAEBB4F">
             <wp:extent cx="5600000" cy="3723585"/>
             <wp:effectExtent l="0" t="0" r="0" b="0"/>
             <wp:docPr id="103" name="Diagrama de Clases"/>
@@ -2655,7 +2655,7 @@
           <w:noProof/>
         </w:rPr>
         <w:drawing>
-          <wp:inline distT="0" distB="0" distL="0" distR="0" wp14:anchorId="3E45E41D" wp14:editId="1A4CF824">
+          <wp:inline distT="0" distB="0" distL="0" distR="0" wp14:anchorId="2954C7B4" wp14:editId="347DFD90">
             <wp:extent cx="5599999" cy="3565199"/>
             <wp:effectExtent l="0" t="0" r="0" b="0"/>
             <wp:docPr id="104" name="Diagrama de Secuencia"/>
@@ -2718,7 +2718,7 @@
           <w:noProof/>
         </w:rPr>
         <w:drawing>
-          <wp:inline distT="0" distB="0" distL="0" distR="0" wp14:anchorId="15D83B1F" wp14:editId="2360D706">
+          <wp:inline distT="0" distB="0" distL="0" distR="0" wp14:anchorId="6075477D" wp14:editId="0E447FDF">
             <wp:extent cx="5429250" cy="6134100"/>
             <wp:effectExtent l="0" t="0" r="0" b="0"/>
             <wp:docPr id="105" name="Diagrama de Componentes"/>
@@ -5869,9 +5869,9 @@
   <w:rsids>
     <w:rsidRoot w:val="00960213"/>
     <w:rsid w:val="00004AB9"/>
-    <w:rsid w:val="00035B88"/>
     <w:rsid w:val="000609BA"/>
     <w:rsid w:val="00153A14"/>
+    <w:rsid w:val="00154E89"/>
     <w:rsid w:val="00194DF5"/>
     <w:rsid w:val="001B14B7"/>
     <w:rsid w:val="002835FC"/>
@@ -5884,8 +5884,8 @@
     <w:rsid w:val="00704192"/>
     <w:rsid w:val="00825B36"/>
     <w:rsid w:val="00960213"/>
+    <w:rsid w:val="009C478C"/>
     <w:rsid w:val="00AE6FE7"/>
-    <w:rsid w:val="00B170C5"/>
     <w:rsid w:val="00BD2436"/>
     <w:rsid w:val="00C47BA2"/>
     <w:rsid w:val="00C5036F"/>

</xml_diff>

<commit_message>
fix(docs): corregir nomenclatura del diagrama de secuencia en Documento 05
</commit_message>
<xml_diff>
--- a/docs/Fase 2/Evidencias Proyecto (Version Agil)/Documento 05 - Documento de Diseño.docx
+++ b/docs/Fase 2/Evidencias Proyecto (Version Agil)/Documento 05 - Documento de Diseño.docx
@@ -2656,7 +2656,7 @@
         </w:rPr>
         <w:drawing>
           <wp:inline distT="0" distB="0" distL="0" distR="0" wp14:anchorId="2954C7B4" wp14:editId="347DFD90">
-            <wp:extent cx="5599999" cy="3565199"/>
+            <wp:extent cx="5599999" cy="3718238"/>
             <wp:effectExtent l="0" t="0" r="0" b="0"/>
             <wp:docPr id="104" name="Diagrama de Secuencia"/>
             <wp:cNvGraphicFramePr>
@@ -2678,7 +2678,7 @@
                   <pic:spPr>
                     <a:xfrm>
                       <a:off x="0" y="0"/>
-                      <a:ext cx="5599999" cy="3565199"/>
+                      <a:ext cx="5599999" cy="3718238"/>
                     </a:xfrm>
                     <a:prstGeom prst="rect">
                       <a:avLst/>

</xml_diff>